<commit_message>
Stampo referti: intestazione fissa Dr. Med. Giorgio Moschovitis
Nome, Spec. FMH Medicina Interna e Cardiologia, CAS Insufficienza
Cardiaca-HF, indirizzo e Tel: +41 91 640 40 40 direttamente nello stampo
(le qualifiche con lo stile della riga dell'indirizzo). Scelta esplicita
del medico: per ora un'intestazione sola; in futuro dovrà seguire il
medico che firma il referto (più medici per studio).

Co-Authored-By: Claude Fable 5 <noreply@anthropic.com>
</commit_message>
<xml_diff>
--- a/modelli/referto-carta-intestata.docx
+++ b/modelli/referto-carta-intestata.docx
@@ -625,7 +625,37 @@
         <w:sz w:val="16"/>
         <w:szCs w:val="16"/>
       </w:rPr>
-      <w:t xml:space="preserve">{{medico}}</w:t>
+      <w:t xml:space="preserve">Dr. Med. Giorgio Moschovitis</w:t>
+    </w:r>
+  </w:p>
+  <w:p>
+    <w:pPr>
+      <w:rPr>
+        <w:rFonts w:ascii="Avenir Book" w:hAnsi="Avenir Book" w:cstheme="majorHAnsi"/>
+      </w:rPr>
+    </w:pPr>
+    <w:r>
+      <w:rPr>
+        <w:rFonts w:ascii="Avenir Book" w:hAnsi="Avenir Book" w:cstheme="majorHAnsi"/>
+        <w:sz w:val="16"/>
+        <w:szCs w:val="16"/>
+      </w:rPr>
+      <w:t xml:space="preserve">Spec. FMH Medicina Interna e Cardiologia</w:t>
+    </w:r>
+  </w:p>
+  <w:p>
+    <w:pPr>
+      <w:rPr>
+        <w:rFonts w:ascii="Avenir Book" w:hAnsi="Avenir Book" w:cstheme="majorHAnsi"/>
+      </w:rPr>
+    </w:pPr>
+    <w:r>
+      <w:rPr>
+        <w:rFonts w:ascii="Avenir Book" w:hAnsi="Avenir Book" w:cstheme="majorHAnsi"/>
+        <w:sz w:val="16"/>
+        <w:szCs w:val="16"/>
+      </w:rPr>
+      <w:t xml:space="preserve">Certificazione Studi Avanzati (CAS) in Insufficienza Cardiaca-HF</w:t>
     </w:r>
   </w:p>
   <w:p>
@@ -655,7 +685,7 @@
         <w:rFonts w:ascii="Avenir Book" w:hAnsi="Avenir Book" w:cstheme="majorHAnsi"/>
         <w:sz w:val="16"/>
       </w:rPr>
-      <w:t xml:space="preserve">Tel: {{telefono}}</w:t>
+      <w:t xml:space="preserve">Tel: +41 91 640 40 40</w:t>
     </w:r>
   </w:p>
 </w:hdr>

</xml_diff>

<commit_message>
Forma della segretaria per Moccetti: carta intestata per medico nello stampo Word (segnaposto in intestazione, via, titolo, copia), destinatario su più righe con rubrica invianti, data del dettato dall'header DSS + sigla, titolo con data visita; lettera con date svizzere, chiusura e firma dal profilo, terapia ripresa dalla lettera precedente; dizionario seme RIVA/RCx
Co-Authored-By: Claude Fable 5.1 <noreply@anthropic.com>
</commit_message>
<xml_diff>
--- a/modelli/referto-carta-intestata.docx
+++ b/modelli/referto-carta-intestata.docx
@@ -75,7 +75,7 @@
                 <w:rFonts w:asciiTheme="majorHAnsi" w:hAnsiTheme="majorHAnsi" w:cstheme="majorHAnsi"/>
                 <w:lang w:val="it-IT"/>
               </w:rPr>
-              <w:t>Via email</w:t>
+              <w:t>{{via}}</w:t>
             </w:r>
           </w:p>
           <w:p>
@@ -263,7 +263,7 @@
                 <w:rFonts w:asciiTheme="majorHAnsi" w:hAnsiTheme="majorHAnsi" w:cstheme="majorHAnsi"/>
                 <w:lang w:val="it-IT"/>
               </w:rPr>
-              <w:t>VISITA AMBULATORIALE, RAPPORTO</w:t>
+              <w:t>{{titolo}}</w:t>
             </w:r>
           </w:p>
         </w:tc>
@@ -385,7 +385,7 @@
           <w:rFonts w:asciiTheme="majorHAnsi" w:hAnsiTheme="majorHAnsi" w:cstheme="majorHAnsi"/>
           <w:lang w:val="it-IT"/>
         </w:rPr>
-        <w:t>Copia: alla paziente</w:t>
+        <w:t>{{copia}}</w:t>
       </w:r>
     </w:p>
     <w:sectPr>
@@ -625,7 +625,7 @@
         <w:sz w:val="16"/>
         <w:szCs w:val="16"/>
       </w:rPr>
-      <w:t xml:space="preserve">Dr. Med. Giorgio Moschovitis</w:t>
+      <w:t xml:space="preserve">{{int_nome}}</w:t>
     </w:r>
   </w:p>
   <w:p>
@@ -640,52 +640,7 @@
         <w:sz w:val="16"/>
         <w:szCs w:val="16"/>
       </w:rPr>
-      <w:t xml:space="preserve">Spec. FMH Medicina Interna e Cardiologia</w:t>
-    </w:r>
-  </w:p>
-  <w:p>
-    <w:pPr>
-      <w:rPr>
-        <w:rFonts w:ascii="Avenir Book" w:hAnsi="Avenir Book" w:cstheme="majorHAnsi"/>
-      </w:rPr>
-    </w:pPr>
-    <w:r>
-      <w:rPr>
-        <w:rFonts w:ascii="Avenir Book" w:hAnsi="Avenir Book" w:cstheme="majorHAnsi"/>
-        <w:sz w:val="16"/>
-        <w:szCs w:val="16"/>
-      </w:rPr>
-      <w:t xml:space="preserve">Certificazione Studi Avanzati (CAS) in Insufficienza Cardiaca-HF</w:t>
-    </w:r>
-  </w:p>
-  <w:p>
-    <w:pPr>
-      <w:rPr>
-        <w:rFonts w:ascii="Avenir Book" w:hAnsi="Avenir Book" w:cstheme="majorHAnsi"/>
-      </w:rPr>
-    </w:pPr>
-    <w:r>
-      <w:rPr>
-        <w:rFonts w:ascii="Avenir Book" w:hAnsi="Avenir Book" w:cstheme="majorHAnsi"/>
-        <w:sz w:val="16"/>
-        <w:szCs w:val="16"/>
-      </w:rPr>
-      <w:t>Via Pretorio 9, 6900 Lugano (CH)</w:t>
-    </w:r>
-  </w:p>
-  <w:p>
-    <w:pPr>
-      <w:pStyle w:val="Intestazione"/>
-      <w:rPr>
-        <w:rFonts w:ascii="Avenir Book" w:hAnsi="Avenir Book" w:cstheme="majorHAnsi"/>
-      </w:rPr>
-    </w:pPr>
-    <w:r>
-      <w:rPr>
-        <w:rFonts w:ascii="Avenir Book" w:hAnsi="Avenir Book" w:cstheme="majorHAnsi"/>
-        <w:sz w:val="16"/>
-      </w:rPr>
-      <w:t xml:space="preserve">Tel: +41 91 640 40 40</w:t>
+      <w:t xml:space="preserve">{{intestazione}}</w:t>
     </w:r>
   </w:p>
 </w:hdr>

</xml_diff>